<commit_message>
mitkat issues solved as told by siddhi fixed :)
</commit_message>
<xml_diff>
--- a/Automation/backend/Mitkat_Base_template.docx
+++ b/Automation/backend/Mitkat_Base_template.docx
@@ -5816,642 +5816,83 @@
       <w:bookmarkEnd w:id="10"/>
     </w:p>
     <w:p>
-      <w:pPr>
-        <w:rPr>
-          <w:rFonts w:asciiTheme="majorHAnsi" w:hAnsiTheme="majorHAnsi" w:cstheme="majorHAnsi"/>
-        </w:rPr>
-      </w:pPr>
       <w:r>
-        <w:rPr>
-          <w:rFonts w:asciiTheme="majorHAnsi" w:hAnsiTheme="majorHAnsi" w:cstheme="majorHAnsi"/>
-        </w:rPr>
-        <w:t xml:space="preserve"> </w:t>
+        <w:t>{{r ES_NARR}}</w:t>
       </w:r>
     </w:p>
     <w:p>
-      <w:pPr>
-        <w:rPr>
-          <w:rFonts w:asciiTheme="majorHAnsi" w:hAnsiTheme="majorHAnsi" w:cstheme="majorHAnsi"/>
-          <w:sz w:val="22"/>
-          <w:szCs w:val="22"/>
-        </w:rPr>
-      </w:pPr>
       <w:r>
-        <w:rPr>
-          <w:rFonts w:asciiTheme="majorHAnsi" w:hAnsiTheme="majorHAnsi" w:cstheme="majorHAnsi"/>
-          <w:sz w:val="22"/>
-          <w:szCs w:val="22"/>
-        </w:rPr>
-        <w:t>A comprehensive security assessment of the application identified multiple vulnerabilities across identity validation, input handling, financial integrity, and client-side security. These weaknesses included improper PAN card validation, lack of server-side input sanitization, susceptibility to stored XSS and injection attacks, absence of rate limiting, handling of negative financial inputs, and exposure to text/Unicode-based denial-of-service conditions. In combination, these flaws created opportunities for unauthorized access, large-scale fraud, denial-of-service, sensitive data compromise, and regulatory non-compliance. Immediate remediation steps were implemented, and continuous monitoring is now in place to prevent re-exploitation.</w:t>
+        <w:t> </w:t>
       </w:r>
     </w:p>
     <w:p>
-      <w:pPr>
-        <w:rPr>
-          <w:rFonts w:asciiTheme="majorHAnsi" w:hAnsiTheme="majorHAnsi" w:cstheme="majorHAnsi"/>
-          <w:sz w:val="22"/>
-          <w:szCs w:val="22"/>
-        </w:rPr>
-      </w:pPr>
-    </w:p>
-    <w:p>
-      <w:pPr>
-        <w:rPr>
-          <w:rFonts w:asciiTheme="majorHAnsi" w:hAnsiTheme="majorHAnsi" w:cstheme="majorHAnsi"/>
-          <w:b/>
-          <w:bCs/>
-          <w:sz w:val="22"/>
-          <w:szCs w:val="22"/>
-        </w:rPr>
-      </w:pPr>
       <w:r>
-        <w:rPr>
-          <w:rFonts w:asciiTheme="majorHAnsi" w:hAnsiTheme="majorHAnsi" w:cstheme="majorHAnsi"/>
-          <w:b/>
-          <w:bCs/>
-          <w:sz w:val="22"/>
-          <w:szCs w:val="22"/>
-        </w:rPr>
-        <w:t>Findings &amp; Impact:</w:t>
+        <w:t>{%p for o in ES_PHASE1 %}</w:t>
       </w:r>
     </w:p>
     <w:p>
-      <w:pPr>
-        <w:rPr>
-          <w:rFonts w:asciiTheme="majorHAnsi" w:hAnsiTheme="majorHAnsi" w:cstheme="majorHAnsi"/>
-          <w:sz w:val="22"/>
-          <w:szCs w:val="22"/>
-        </w:rPr>
-      </w:pPr>
       <w:r>
-        <w:rPr>
-          <w:rFonts w:asciiTheme="majorHAnsi" w:hAnsiTheme="majorHAnsi" w:cstheme="majorHAnsi"/>
-          <w:b/>
-          <w:bCs/>
-          <w:sz w:val="22"/>
-          <w:szCs w:val="22"/>
-        </w:rPr>
-        <w:t>1. PAN Card Validation Weaknesses</w:t>
+        <w:t>{{ o.title }}</w:t>
       </w:r>
+    </w:p>
+    <w:p>
       <w:r>
-        <w:rPr>
-          <w:rFonts w:asciiTheme="majorHAnsi" w:hAnsiTheme="majorHAnsi" w:cstheme="majorHAnsi"/>
-          <w:sz w:val="22"/>
-          <w:szCs w:val="22"/>
-        </w:rPr>
-        <w:br w:type="textWrapping"/>
+        <w:t>{{ o.description }}</w:t>
       </w:r>
+    </w:p>
+    <w:p>
       <w:r>
-        <w:rPr>
-          <w:rFonts w:asciiTheme="majorHAnsi" w:hAnsiTheme="majorHAnsi" w:cstheme="majorHAnsi"/>
-          <w:sz w:val="22"/>
-          <w:szCs w:val="22"/>
-        </w:rPr>
-        <w:t> 1.1. The system allows duplicate, temporary, or false PAN card entries without proper uniqueness checks, and PAN inputs are not rate limited.</w:t>
+        <w:t>Threat Perception: {{ o.threat_perception }}</w:t>
       </w:r>
+    </w:p>
+    <w:p>
       <w:r>
-        <w:rPr>
-          <w:rFonts w:asciiTheme="majorHAnsi" w:hAnsiTheme="majorHAnsi" w:cstheme="majorHAnsi"/>
-          <w:sz w:val="22"/>
-          <w:szCs w:val="22"/>
-        </w:rPr>
-        <w:br w:type="textWrapping"/>
+        <w:t>{%p endfor %}</w:t>
       </w:r>
+    </w:p>
+    <w:p>
       <w:r>
-        <w:rPr>
-          <w:rFonts w:asciiTheme="majorHAnsi" w:hAnsiTheme="majorHAnsi" w:cstheme="majorHAnsi"/>
-          <w:sz w:val="22"/>
-          <w:szCs w:val="22"/>
-        </w:rPr>
-        <w:t> 1.2. Impact: Enables large-scale identity theft, PAN enumeration attacks, fraud, regulatory non-compliance, reputational damage, and potential legal actions.</w:t>
+        <w:t> </w:t>
       </w:r>
+    </w:p>
+    <w:p>
       <w:r>
-        <w:rPr>
-          <w:rFonts w:asciiTheme="majorHAnsi" w:hAnsiTheme="majorHAnsi" w:cstheme="majorHAnsi"/>
-          <w:sz w:val="22"/>
-          <w:szCs w:val="22"/>
-        </w:rPr>
-        <w:br w:type="textWrapping"/>
+        <w:t>{{ ES_PHASE2 }}</w:t>
       </w:r>
+    </w:p>
+    <w:p>
       <w:r>
-        <w:rPr>
-          <w:rFonts w:asciiTheme="majorHAnsi" w:hAnsiTheme="majorHAnsi" w:cstheme="majorHAnsi"/>
-          <w:sz w:val="22"/>
-          <w:szCs w:val="22"/>
-        </w:rPr>
-        <w:t> 1.3. Remediation: Enforce PAN uniqueness at database and application levels, add duplicate PAN detection, and apply strict rate limiting with monitoring.</w:t>
+        <w:t> </w:t>
       </w:r>
     </w:p>
     <w:p>
-      <w:pPr>
-        <w:rPr>
-          <w:rFonts w:asciiTheme="majorHAnsi" w:hAnsiTheme="majorHAnsi" w:cstheme="majorHAnsi"/>
-          <w:sz w:val="22"/>
-          <w:szCs w:val="22"/>
-        </w:rPr>
-      </w:pPr>
-    </w:p>
-    <w:p>
-      <w:pPr>
-        <w:rPr>
-          <w:rFonts w:asciiTheme="majorHAnsi" w:hAnsiTheme="majorHAnsi" w:cstheme="majorHAnsi"/>
-          <w:sz w:val="22"/>
-          <w:szCs w:val="22"/>
-        </w:rPr>
-      </w:pPr>
       <w:r>
-        <w:rPr>
-          <w:rFonts w:asciiTheme="majorHAnsi" w:hAnsiTheme="majorHAnsi" w:cstheme="majorHAnsi"/>
-          <w:b/>
-          <w:bCs/>
-          <w:sz w:val="22"/>
-          <w:szCs w:val="22"/>
-        </w:rPr>
-        <w:t>2. Input Validation &amp; Injection Risks (Buyer Name, Limit, Target)</w:t>
+        <w:t>{%p if ES_CHART %}</w:t>
       </w:r>
+    </w:p>
+    <w:p>
       <w:r>
-        <w:rPr>
-          <w:rFonts w:asciiTheme="majorHAnsi" w:hAnsiTheme="majorHAnsi" w:cstheme="majorHAnsi"/>
-          <w:sz w:val="22"/>
-          <w:szCs w:val="22"/>
-        </w:rPr>
-        <w:br w:type="textWrapping"/>
+        <w:t>{{p ES_CHART}}</w:t>
       </w:r>
+    </w:p>
+    <w:p>
       <w:r>
-        <w:rPr>
-          <w:rFonts w:asciiTheme="majorHAnsi" w:hAnsiTheme="majorHAnsi" w:cstheme="majorHAnsi"/>
-          <w:sz w:val="22"/>
-          <w:szCs w:val="22"/>
-        </w:rPr>
-        <w:t> 2.1. Fields like Buyer Name, Limit, and Target lack proper validation, allowing malicious payloads or invalid data. Buyer Name field is also vulnerable to stored XSS.</w:t>
+        <w:t>{%p endif %}</w:t>
       </w:r>
+    </w:p>
+    <w:p>
       <w:r>
-        <w:rPr>
-          <w:rFonts w:asciiTheme="majorHAnsi" w:hAnsiTheme="majorHAnsi" w:cstheme="majorHAnsi"/>
-          <w:sz w:val="22"/>
-          <w:szCs w:val="22"/>
-        </w:rPr>
-        <w:br w:type="textWrapping"/>
+        <w:t> </w:t>
       </w:r>
+    </w:p>
+    <w:p>
       <w:r>
-        <w:rPr>
-          <w:rFonts w:asciiTheme="majorHAnsi" w:hAnsiTheme="majorHAnsi" w:cstheme="majorHAnsi"/>
-          <w:sz w:val="22"/>
-          <w:szCs w:val="22"/>
-        </w:rPr>
-        <w:t> 2.2. Impact: Risks include SQLi/Command Injection, stored XSS (account takeover, malware propagation, data theft), financial fraud through manipulated values, and full data compromise with loss of system integrity.</w:t>
-      </w:r>
-      <w:r>
-        <w:rPr>
-          <w:rFonts w:asciiTheme="majorHAnsi" w:hAnsiTheme="majorHAnsi" w:cstheme="majorHAnsi"/>
-          <w:sz w:val="22"/>
-          <w:szCs w:val="22"/>
-        </w:rPr>
-        <w:br w:type="textWrapping"/>
-      </w:r>
-      <w:r>
-        <w:rPr>
-          <w:rFonts w:asciiTheme="majorHAnsi" w:hAnsiTheme="majorHAnsi" w:cstheme="majorHAnsi"/>
-          <w:sz w:val="22"/>
-          <w:szCs w:val="22"/>
-        </w:rPr>
-        <w:t> 2.3. Remediation: Implement strict server-side validation using whitelisting/regex, sanitize and encode outputs, enforce CSP, and use secure libraries for input/output handling.</w:t>
-      </w:r>
-    </w:p>
-    <w:p>
-      <w:pPr>
-        <w:rPr>
-          <w:rFonts w:asciiTheme="majorHAnsi" w:hAnsiTheme="majorHAnsi" w:cstheme="majorHAnsi"/>
-          <w:sz w:val="22"/>
-          <w:szCs w:val="22"/>
-        </w:rPr>
-      </w:pPr>
-    </w:p>
-    <w:p>
-      <w:pPr>
-        <w:rPr>
-          <w:rFonts w:asciiTheme="majorHAnsi" w:hAnsiTheme="majorHAnsi" w:cstheme="majorHAnsi"/>
-          <w:sz w:val="22"/>
-          <w:szCs w:val="22"/>
-        </w:rPr>
-      </w:pPr>
-      <w:r>
-        <w:rPr>
-          <w:rFonts w:asciiTheme="majorHAnsi" w:hAnsiTheme="majorHAnsi" w:cstheme="majorHAnsi"/>
-          <w:b/>
-          <w:bCs/>
-          <w:sz w:val="22"/>
-          <w:szCs w:val="22"/>
-        </w:rPr>
-        <w:t>3. Denial of Service via Text &amp; Unicode Overflows</w:t>
-      </w:r>
-      <w:r>
-        <w:rPr>
-          <w:rFonts w:asciiTheme="majorHAnsi" w:hAnsiTheme="majorHAnsi" w:cstheme="majorHAnsi"/>
-          <w:sz w:val="22"/>
-          <w:szCs w:val="22"/>
-        </w:rPr>
-        <w:br w:type="textWrapping"/>
-      </w:r>
-      <w:r>
-        <w:rPr>
-          <w:rFonts w:asciiTheme="majorHAnsi" w:hAnsiTheme="majorHAnsi" w:cstheme="majorHAnsi"/>
-          <w:sz w:val="22"/>
-          <w:szCs w:val="22"/>
-        </w:rPr>
-        <w:t> 3.1. Fields (Buyer Name, Limit, Target) accept excessively long input, including Unicode strings, without length restrictions.</w:t>
-      </w:r>
-      <w:r>
-        <w:rPr>
-          <w:rFonts w:asciiTheme="majorHAnsi" w:hAnsiTheme="majorHAnsi" w:cstheme="majorHAnsi"/>
-          <w:sz w:val="22"/>
-          <w:szCs w:val="22"/>
-        </w:rPr>
-        <w:br w:type="textWrapping"/>
-      </w:r>
-      <w:r>
-        <w:rPr>
-          <w:rFonts w:asciiTheme="majorHAnsi" w:hAnsiTheme="majorHAnsi" w:cstheme="majorHAnsi"/>
-          <w:sz w:val="22"/>
-          <w:szCs w:val="22"/>
-        </w:rPr>
-        <w:t> 3.2. Impact: Attackers can trigger denial-of-service by exhausting resources, crashing servers, bypassing security filters, or corrupting data integrity in critical services.</w:t>
-      </w:r>
-      <w:r>
-        <w:rPr>
-          <w:rFonts w:asciiTheme="majorHAnsi" w:hAnsiTheme="majorHAnsi" w:cstheme="majorHAnsi"/>
-          <w:sz w:val="22"/>
-          <w:szCs w:val="22"/>
-        </w:rPr>
-        <w:br w:type="textWrapping"/>
-      </w:r>
-      <w:r>
-        <w:rPr>
-          <w:rFonts w:asciiTheme="majorHAnsi" w:hAnsiTheme="majorHAnsi" w:cstheme="majorHAnsi"/>
-          <w:sz w:val="22"/>
-          <w:szCs w:val="22"/>
-        </w:rPr>
-        <w:t> 3.3. Remediation: Set maximum input length (in characters/bytes), normalize Unicode input, reject malformed sequences, and apply input throttling early in the workflow.</w:t>
-      </w:r>
-    </w:p>
-    <w:p>
-      <w:pPr>
-        <w:rPr>
-          <w:rFonts w:asciiTheme="majorHAnsi" w:hAnsiTheme="majorHAnsi" w:cstheme="majorHAnsi"/>
-          <w:sz w:val="22"/>
-          <w:szCs w:val="22"/>
-        </w:rPr>
-      </w:pPr>
-    </w:p>
-    <w:p>
-      <w:pPr>
-        <w:rPr>
-          <w:rFonts w:asciiTheme="majorHAnsi" w:hAnsiTheme="majorHAnsi" w:cstheme="majorHAnsi"/>
-          <w:sz w:val="22"/>
-          <w:szCs w:val="22"/>
-        </w:rPr>
-      </w:pPr>
-      <w:r>
-        <w:rPr>
-          <w:rFonts w:asciiTheme="majorHAnsi" w:hAnsiTheme="majorHAnsi" w:cstheme="majorHAnsi"/>
-          <w:b/>
-          <w:bCs/>
-          <w:sz w:val="22"/>
-          <w:szCs w:val="22"/>
-        </w:rPr>
-        <w:t>4. Negative Value Exploitation in Financial Fields</w:t>
-      </w:r>
-      <w:r>
-        <w:rPr>
-          <w:rFonts w:asciiTheme="majorHAnsi" w:hAnsiTheme="majorHAnsi" w:cstheme="majorHAnsi"/>
-          <w:sz w:val="22"/>
-          <w:szCs w:val="22"/>
-        </w:rPr>
-        <w:br w:type="textWrapping"/>
-      </w:r>
-      <w:r>
-        <w:rPr>
-          <w:rFonts w:asciiTheme="majorHAnsi" w:hAnsiTheme="majorHAnsi" w:cstheme="majorHAnsi"/>
-          <w:sz w:val="22"/>
-          <w:szCs w:val="22"/>
-        </w:rPr>
-        <w:t> 4.1. Numeric fields (Limit, Target) allow negative values without boundary validation.</w:t>
-      </w:r>
-      <w:r>
-        <w:rPr>
-          <w:rFonts w:asciiTheme="majorHAnsi" w:hAnsiTheme="majorHAnsi" w:cstheme="majorHAnsi"/>
-          <w:sz w:val="22"/>
-          <w:szCs w:val="22"/>
-        </w:rPr>
-        <w:br w:type="textWrapping"/>
-      </w:r>
-      <w:r>
-        <w:rPr>
-          <w:rFonts w:asciiTheme="majorHAnsi" w:hAnsiTheme="majorHAnsi" w:cstheme="majorHAnsi"/>
-          <w:sz w:val="22"/>
-          <w:szCs w:val="22"/>
-        </w:rPr>
-        <w:t> 4.2. Impact: Enables fraudulent credits, accounting manipulation, misreporting, compliance failures, and direct financial losses.</w:t>
-      </w:r>
-      <w:r>
-        <w:rPr>
-          <w:rFonts w:asciiTheme="majorHAnsi" w:hAnsiTheme="majorHAnsi" w:cstheme="majorHAnsi"/>
-          <w:sz w:val="22"/>
-          <w:szCs w:val="22"/>
-        </w:rPr>
-        <w:br w:type="textWrapping"/>
-      </w:r>
-      <w:r>
-        <w:rPr>
-          <w:rFonts w:asciiTheme="majorHAnsi" w:hAnsiTheme="majorHAnsi" w:cstheme="majorHAnsi"/>
-          <w:sz w:val="22"/>
-          <w:szCs w:val="22"/>
-        </w:rPr>
-        <w:t> 4.3. Remediation: Enforce strict numeric validations to allow only valid positive ranges; reject negative inputs gracefully with error handling.</w:t>
-      </w:r>
-    </w:p>
-    <w:p>
-      <w:pPr>
-        <w:rPr>
-          <w:rFonts w:asciiTheme="majorHAnsi" w:hAnsiTheme="majorHAnsi" w:cstheme="majorHAnsi"/>
-          <w:sz w:val="22"/>
-          <w:szCs w:val="22"/>
-        </w:rPr>
-      </w:pPr>
-    </w:p>
-    <w:p>
-      <w:pPr>
-        <w:rPr>
-          <w:rFonts w:asciiTheme="majorHAnsi" w:hAnsiTheme="majorHAnsi" w:cstheme="majorHAnsi"/>
-          <w:sz w:val="22"/>
-          <w:szCs w:val="22"/>
-        </w:rPr>
-      </w:pPr>
-      <w:r>
-        <w:rPr>
-          <w:rFonts w:asciiTheme="majorHAnsi" w:hAnsiTheme="majorHAnsi" w:cstheme="majorHAnsi"/>
-          <w:b/>
-          <w:bCs/>
-          <w:sz w:val="22"/>
-          <w:szCs w:val="22"/>
-        </w:rPr>
-        <w:t>5. Lack of Rate Limiting Across Inputs</w:t>
-      </w:r>
-      <w:r>
-        <w:rPr>
-          <w:rFonts w:asciiTheme="majorHAnsi" w:hAnsiTheme="majorHAnsi" w:cstheme="majorHAnsi"/>
-          <w:sz w:val="22"/>
-          <w:szCs w:val="22"/>
-        </w:rPr>
-        <w:br w:type="textWrapping"/>
-      </w:r>
-      <w:r>
-        <w:rPr>
-          <w:rFonts w:asciiTheme="majorHAnsi" w:hAnsiTheme="majorHAnsi" w:cstheme="majorHAnsi"/>
-          <w:sz w:val="22"/>
-          <w:szCs w:val="22"/>
-        </w:rPr>
-        <w:t> 5.1. Critical inputs (Buyer Name, Limit, Target, PAN) lack rate limiting.</w:t>
-      </w:r>
-      <w:r>
-        <w:rPr>
-          <w:rFonts w:asciiTheme="majorHAnsi" w:hAnsiTheme="majorHAnsi" w:cstheme="majorHAnsi"/>
-          <w:sz w:val="22"/>
-          <w:szCs w:val="22"/>
-        </w:rPr>
-        <w:br w:type="textWrapping"/>
-      </w:r>
-      <w:r>
-        <w:rPr>
-          <w:rFonts w:asciiTheme="majorHAnsi" w:hAnsiTheme="majorHAnsi" w:cstheme="majorHAnsi"/>
-          <w:sz w:val="22"/>
-          <w:szCs w:val="22"/>
-        </w:rPr>
-        <w:t> 5.2. Impact: Enables brute-force, automated abuse, data exfiltration, enumeration, and large-scale denial-of-service attacks, leading to reputational and financial damage.</w:t>
-      </w:r>
-      <w:r>
-        <w:rPr>
-          <w:rFonts w:asciiTheme="majorHAnsi" w:hAnsiTheme="majorHAnsi" w:cstheme="majorHAnsi"/>
-          <w:sz w:val="22"/>
-          <w:szCs w:val="22"/>
-        </w:rPr>
-        <w:br w:type="textWrapping"/>
-      </w:r>
-      <w:r>
-        <w:rPr>
-          <w:rFonts w:asciiTheme="majorHAnsi" w:hAnsiTheme="majorHAnsi" w:cstheme="majorHAnsi"/>
-          <w:sz w:val="22"/>
-          <w:szCs w:val="22"/>
-        </w:rPr>
-        <w:t> 5.3. Remediation: Apply per-user/IP request throttling, enforce CAPTCHA on sensitive endpoints, and log abnormal submission activity.</w:t>
-      </w:r>
-    </w:p>
-    <w:p>
-      <w:pPr>
-        <w:rPr>
-          <w:rFonts w:asciiTheme="majorHAnsi" w:hAnsiTheme="majorHAnsi" w:cstheme="majorHAnsi"/>
-          <w:sz w:val="22"/>
-          <w:szCs w:val="22"/>
-        </w:rPr>
-      </w:pPr>
-    </w:p>
-    <w:p>
-      <w:pPr>
-        <w:rPr>
-          <w:rFonts w:asciiTheme="majorHAnsi" w:hAnsiTheme="majorHAnsi" w:cstheme="majorHAnsi"/>
-          <w:sz w:val="22"/>
-          <w:szCs w:val="22"/>
-        </w:rPr>
-      </w:pPr>
-      <w:r>
-        <w:rPr>
-          <w:rFonts w:asciiTheme="majorHAnsi" w:hAnsiTheme="majorHAnsi" w:cstheme="majorHAnsi"/>
-          <w:b/>
-          <w:bCs/>
-          <w:sz w:val="22"/>
-          <w:szCs w:val="22"/>
-        </w:rPr>
-        <w:t>6. Insecure Client-Side Controls</w:t>
-      </w:r>
-      <w:r>
-        <w:rPr>
-          <w:rFonts w:asciiTheme="majorHAnsi" w:hAnsiTheme="majorHAnsi" w:cstheme="majorHAnsi"/>
-          <w:sz w:val="22"/>
-          <w:szCs w:val="22"/>
-        </w:rPr>
-        <w:br w:type="textWrapping"/>
-      </w:r>
-      <w:r>
-        <w:rPr>
-          <w:rFonts w:asciiTheme="majorHAnsi" w:hAnsiTheme="majorHAnsi" w:cstheme="majorHAnsi"/>
-          <w:sz w:val="22"/>
-          <w:szCs w:val="22"/>
-        </w:rPr>
-        <w:t> 6.1. Right-click functionality is enabled on sensitive UI components, and CSP is not enforced.</w:t>
-      </w:r>
-      <w:r>
-        <w:rPr>
-          <w:rFonts w:asciiTheme="majorHAnsi" w:hAnsiTheme="majorHAnsi" w:cstheme="majorHAnsi"/>
-          <w:sz w:val="22"/>
-          <w:szCs w:val="22"/>
-        </w:rPr>
-        <w:br w:type="textWrapping"/>
-      </w:r>
-      <w:r>
-        <w:rPr>
-          <w:rFonts w:asciiTheme="majorHAnsi" w:hAnsiTheme="majorHAnsi" w:cstheme="majorHAnsi"/>
-          <w:sz w:val="22"/>
-          <w:szCs w:val="22"/>
-        </w:rPr>
-        <w:t> 6.2. Impact: Exposes application internals via code inspection, facilitates data scraping, enables client-side attacks (XSS, clickjacking), and aids reverse engineering.</w:t>
-      </w:r>
-      <w:r>
-        <w:rPr>
-          <w:rFonts w:asciiTheme="majorHAnsi" w:hAnsiTheme="majorHAnsi" w:cstheme="majorHAnsi"/>
-          <w:sz w:val="22"/>
-          <w:szCs w:val="22"/>
-        </w:rPr>
-        <w:br w:type="textWrapping"/>
-      </w:r>
-      <w:r>
-        <w:rPr>
-          <w:rFonts w:asciiTheme="majorHAnsi" w:hAnsiTheme="majorHAnsi" w:cstheme="majorHAnsi"/>
-          <w:sz w:val="22"/>
-          <w:szCs w:val="22"/>
-        </w:rPr>
-        <w:t> 6.3. Remediation: Disable right-click on sensitive pages, implement robust CSP restricting inline scripts and untrusted origins.</w:t>
-      </w:r>
-    </w:p>
-    <w:p>
-      <w:pPr>
-        <w:jc w:val="right"/>
-        <w:rPr>
-          <w:rFonts w:asciiTheme="majorHAnsi" w:hAnsiTheme="majorHAnsi" w:cstheme="majorHAnsi"/>
-          <w:sz w:val="22"/>
-          <w:szCs w:val="22"/>
-        </w:rPr>
-      </w:pPr>
-      <w:r>
-        <w:rPr>
-          <w:rFonts w:asciiTheme="majorHAnsi" w:hAnsiTheme="majorHAnsi" w:cstheme="majorHAnsi"/>
-          <w:sz w:val="22"/>
-          <w:szCs w:val="22"/>
-        </w:rPr>
-        <w:drawing>
-          <wp:inline distT="0" distB="0" distL="0" distR="0">
-            <wp:extent cx="3399155" cy="2326640"/>
-            <wp:effectExtent l="0" t="0" r="0" b="0"/>
-            <wp:docPr id="2021486166" name="Picture 1"/>
-            <wp:cNvGraphicFramePr>
-              <a:graphicFrameLocks xmlns:a="http://schemas.openxmlformats.org/drawingml/2006/main" noChangeAspect="1"/>
-            </wp:cNvGraphicFramePr>
-            <a:graphic xmlns:a="http://schemas.openxmlformats.org/drawingml/2006/main">
-              <a:graphicData uri="http://schemas.openxmlformats.org/drawingml/2006/picture">
-                <pic:pic xmlns:pic="http://schemas.openxmlformats.org/drawingml/2006/picture">
-                  <pic:nvPicPr>
-                    <pic:cNvPr id="2021486166" name="Picture 1"/>
-                    <pic:cNvPicPr>
-                      <a:picLocks noChangeAspect="1" noChangeArrowheads="1"/>
-                    </pic:cNvPicPr>
-                  </pic:nvPicPr>
-                  <pic:blipFill>
-                    <a:blip r:embed="rId8" cstate="print">
-                      <a:extLst>
-                        <a:ext uri="{28A0092B-C50C-407E-A947-70E740481C1C}">
-                          <a14:useLocalDpi xmlns:a14="http://schemas.microsoft.com/office/drawing/2010/main" val="0"/>
-                        </a:ext>
-                      </a:extLst>
-                    </a:blip>
-                    <a:srcRect l="22307" t="17164" r="26442" b="20463"/>
-                    <a:stretch>
-                      <a:fillRect/>
-                    </a:stretch>
-                  </pic:blipFill>
-                  <pic:spPr>
-                    <a:xfrm>
-                      <a:off x="0" y="0"/>
-                      <a:ext cx="3466200" cy="2372622"/>
-                    </a:xfrm>
-                    <a:prstGeom prst="rect">
-                      <a:avLst/>
-                    </a:prstGeom>
-                    <a:noFill/>
-                    <a:ln>
-                      <a:noFill/>
-                    </a:ln>
-                  </pic:spPr>
-                </pic:pic>
-              </a:graphicData>
-            </a:graphic>
-          </wp:inline>
-        </w:drawing>
-      </w:r>
-    </w:p>
-    <w:p>
-      <w:pPr>
-        <w:rPr>
-          <w:rFonts w:asciiTheme="majorHAnsi" w:hAnsiTheme="majorHAnsi" w:cstheme="majorHAnsi"/>
-          <w:sz w:val="22"/>
-          <w:szCs w:val="22"/>
-        </w:rPr>
-      </w:pPr>
-    </w:p>
-    <w:p>
-      <w:pPr>
-        <w:rPr>
-          <w:rFonts w:asciiTheme="majorHAnsi" w:hAnsiTheme="majorHAnsi" w:cstheme="majorHAnsi"/>
-          <w:b/>
-          <w:bCs/>
-          <w:sz w:val="22"/>
-          <w:szCs w:val="22"/>
-        </w:rPr>
-      </w:pPr>
-      <w:r>
-        <w:rPr>
-          <w:rFonts w:asciiTheme="majorHAnsi" w:hAnsiTheme="majorHAnsi" w:cstheme="majorHAnsi"/>
-          <w:b/>
-          <w:bCs/>
-          <w:sz w:val="22"/>
-          <w:szCs w:val="22"/>
-        </w:rPr>
         <w:t>Conclusion</w:t>
       </w:r>
     </w:p>
     <w:p>
-      <w:pPr>
-        <w:rPr>
-          <w:rFonts w:asciiTheme="majorHAnsi" w:hAnsiTheme="majorHAnsi" w:cstheme="majorHAnsi"/>
-          <w:sz w:val="22"/>
-          <w:szCs w:val="22"/>
-        </w:rPr>
-      </w:pPr>
       <w:r>
-        <w:rPr>
-          <w:rFonts w:asciiTheme="majorHAnsi" w:hAnsiTheme="majorHAnsi" w:cstheme="majorHAnsi"/>
-          <w:sz w:val="22"/>
-          <w:szCs w:val="22"/>
-        </w:rPr>
-        <w:t xml:space="preserve">The identified vulnerabilities posed a significant security risk, but immediate remediation was implemented to mitigate threats. Continuous monitoring, vulnerability patching, and security best practices will be enforced to prevent similar risks in the future. </w:t>
-      </w:r>
-    </w:p>
-    <w:p>
-      <w:pPr>
-        <w:spacing w:after="160" w:line="259" w:lineRule="auto"/>
-        <w:rPr>
-          <w:rFonts w:asciiTheme="minorHAnsi" w:hAnsiTheme="minorHAnsi" w:eastAsiaTheme="majorEastAsia" w:cstheme="minorHAnsi"/>
-          <w:color w:val="002060"/>
-          <w:sz w:val="44"/>
-          <w:szCs w:val="44"/>
-        </w:rPr>
-      </w:pPr>
-      <w:r>
-        <w:rPr>
-          <w:rFonts w:asciiTheme="minorHAnsi" w:hAnsiTheme="minorHAnsi" w:cstheme="minorHAnsi"/>
-          <w:color w:val="002060"/>
-          <w:sz w:val="44"/>
-          <w:szCs w:val="44"/>
-        </w:rPr>
-        <w:br w:type="page"/>
+        <w:t>{{ ES_CONCLUSION }}</w:t>
       </w:r>
     </w:p>
     <w:p>

</xml_diff>